<commit_message>
Back on track, here is the hopefully actually ammended file!
</commit_message>
<xml_diff>
--- a/AsfG_Portfolio_2505087.docx
+++ b/AsfG_Portfolio_2505087.docx
@@ -4628,8 +4628,323 @@
       </w:pPr>
       <w:r>
         <w:lastRenderedPageBreak/>
+        <w:t>[Wk</w:t>
+      </w:r>
+      <w:r>
+        <w:t>5, LO4</w:t>
+      </w:r>
+      <w:r>
+        <w:t xml:space="preserve">] </w:t>
+      </w:r>
+      <w:r>
+        <w:t>Weekly Timetable</w:t>
+      </w:r>
+    </w:p>
+    <w:p>
+      <w:pPr>
+        <w:pStyle w:val="Quote"/>
+      </w:pPr>
+      <w:r>
+        <w:t>Update the heading and insert the deliverable for this challenge. If you need subsections you can use Heading 2 or 3; don’t use Heading 1 again until the next challenge.</w:t>
+      </w:r>
+    </w:p>
+    <w:p>
+      <w:pPr>
+        <w:pStyle w:val="Quote"/>
+      </w:pPr>
+      <w:r>
+        <w:t>Remember the other guidance in the assignment page about formatting, inserting images, and other things.</w:t>
+      </w:r>
+    </w:p>
+    <w:p>
+      <w:pPr>
+        <w:pStyle w:val="Quote"/>
+      </w:pPr>
+      <w:r>
+        <w:t>Scope &amp; word count limit (or equivalent): Varies by challenge: see the challenge page.</w:t>
+      </w:r>
+    </w:p>
+    <w:p>
+      <w:pPr>
+        <w:pStyle w:val="Quote"/>
+      </w:pPr>
+      <w:r>
+        <w:t>Get ready for the next challenge by taking a copy of the heading from here (and optionally the purple text, but remember to remove it before submission).</w:t>
+      </w:r>
+    </w:p>
+    <w:p>
+      <w:r>
+        <w:t>[Insert the deliverable for this challenge here.]</w:t>
+      </w:r>
+    </w:p>
+    <w:p>
+      <w:pPr>
+        <w:pStyle w:val="Heading1"/>
+      </w:pPr>
+      <w:r>
+        <w:lastRenderedPageBreak/>
         <w:t>[</w:t>
       </w:r>
+      <w:r>
+        <w:t>Wk5, LO3,4</w:t>
+      </w:r>
+      <w:r>
+        <w:t xml:space="preserve">] </w:t>
+      </w:r>
+      <w:r>
+        <w:t>Module Timeline Diagram</w:t>
+      </w:r>
+    </w:p>
+    <w:p>
+      <w:pPr>
+        <w:pStyle w:val="Quote"/>
+      </w:pPr>
+      <w:r>
+        <w:t>Update the heading and insert the deliverable for this challenge. If you need subsections you can use Heading 2 or 3; don’t use Heading 1 again until the next challenge.</w:t>
+      </w:r>
+    </w:p>
+    <w:p>
+      <w:pPr>
+        <w:pStyle w:val="Quote"/>
+      </w:pPr>
+      <w:r>
+        <w:t>Remember the other guidance in the assignment page about formatting, inserting images, and other things.</w:t>
+      </w:r>
+    </w:p>
+    <w:p>
+      <w:pPr>
+        <w:pStyle w:val="Quote"/>
+      </w:pPr>
+      <w:r>
+        <w:t>Scope &amp; word count limit (or equivalent): Varies by challenge: see the challenge page.</w:t>
+      </w:r>
+    </w:p>
+    <w:p>
+      <w:pPr>
+        <w:pStyle w:val="Quote"/>
+      </w:pPr>
+      <w:r>
+        <w:t>Get ready for the next challenge by taking a copy of the heading from here (and optionally the purple text, but remember to remove it before submission).</w:t>
+      </w:r>
+    </w:p>
+    <w:p>
+      <w:r>
+        <w:t>[Insert the deliverable for this challenge here.]</w:t>
+      </w:r>
+    </w:p>
+    <w:p/>
+    <w:p/>
+    <w:p>
+      <w:pPr>
+        <w:pStyle w:val="Heading1"/>
+      </w:pPr>
+      <w:r>
+        <w:lastRenderedPageBreak/>
+        <w:t>[Wk</w:t>
+      </w:r>
+      <w:r>
+        <w:t>5, LO4</w:t>
+      </w:r>
+      <w:r>
+        <w:t xml:space="preserve">] </w:t>
+      </w:r>
+      <w:r>
+        <w:t>Mystery Photo!</w:t>
+      </w:r>
+    </w:p>
+    <w:p>
+      <w:pPr>
+        <w:pStyle w:val="Quote"/>
+      </w:pPr>
+      <w:r>
+        <w:t>Update the heading and insert the deliverable for this challenge. If you need subsections you can use Heading 2 or 3; don’t use Heading 1 again until the next challenge.</w:t>
+      </w:r>
+    </w:p>
+    <w:p>
+      <w:pPr>
+        <w:pStyle w:val="Quote"/>
+      </w:pPr>
+      <w:r>
+        <w:t>Remember the other guidance in the assignment page about formatting, inserting images, and other things.</w:t>
+      </w:r>
+    </w:p>
+    <w:p>
+      <w:pPr>
+        <w:pStyle w:val="Quote"/>
+      </w:pPr>
+      <w:r>
+        <w:t>Scope &amp; word count limit (or equivalent): Varies by challenge: see the challenge page.</w:t>
+      </w:r>
+    </w:p>
+    <w:p>
+      <w:pPr>
+        <w:pStyle w:val="Quote"/>
+      </w:pPr>
+      <w:r>
+        <w:t>Get ready for the next challenge by taking a copy of the heading from here (and optionally the purple text, but remember to remove it before submission).</w:t>
+      </w:r>
+    </w:p>
+    <w:p>
+      <w:r>
+        <w:t>[Insert the deliverable for this challenge here.]</w:t>
+      </w:r>
+    </w:p>
+    <w:p>
+      <w:pPr>
+        <w:pStyle w:val="Heading1"/>
+      </w:pPr>
+      <w:r>
+        <w:lastRenderedPageBreak/>
+        <w:t>[Wk</w:t>
+      </w:r>
+      <w:r>
+        <w:t>6</w:t>
+      </w:r>
+      <w:r>
+        <w:t xml:space="preserve">, </w:t>
+      </w:r>
+      <w:r>
+        <w:t>LO4</w:t>
+      </w:r>
+      <w:r>
+        <w:t xml:space="preserve">] </w:t>
+      </w:r>
+      <w:r>
+        <w:t>Version Control Playground</w:t>
+      </w:r>
+    </w:p>
+    <w:p>
+      <w:pPr>
+        <w:pStyle w:val="Quote"/>
+      </w:pPr>
+      <w:r>
+        <w:rPr>
+          <w:noProof/>
+        </w:rPr>
+        <w:drawing>
+          <wp:inline distT="0" distB="0" distL="0" distR="0" wp14:anchorId="49D799D3" wp14:editId="6F350745">
+            <wp:extent cx="5724525" cy="3686175"/>
+            <wp:effectExtent l="0" t="0" r="9525" b="9525"/>
+            <wp:docPr id="1528915968" name="Picture 2"/>
+            <wp:cNvGraphicFramePr>
+              <a:graphicFrameLocks xmlns:a="http://schemas.openxmlformats.org/drawingml/2006/main" noChangeAspect="1"/>
+            </wp:cNvGraphicFramePr>
+            <a:graphic xmlns:a="http://schemas.openxmlformats.org/drawingml/2006/main">
+              <a:graphicData uri="http://schemas.openxmlformats.org/drawingml/2006/picture">
+                <pic:pic xmlns:pic="http://schemas.openxmlformats.org/drawingml/2006/picture">
+                  <pic:nvPicPr>
+                    <pic:cNvPr id="0" name="Picture 2"/>
+                    <pic:cNvPicPr>
+                      <a:picLocks noChangeAspect="1" noChangeArrowheads="1"/>
+                    </pic:cNvPicPr>
+                  </pic:nvPicPr>
+                  <pic:blipFill>
+                    <a:blip r:embed="rId25">
+                      <a:extLst>
+                        <a:ext uri="{28A0092B-C50C-407E-A947-70E740481C1C}">
+                          <a14:useLocalDpi xmlns:a14="http://schemas.microsoft.com/office/drawing/2010/main" val="0"/>
+                        </a:ext>
+                      </a:extLst>
+                    </a:blip>
+                    <a:srcRect/>
+                    <a:stretch>
+                      <a:fillRect/>
+                    </a:stretch>
+                  </pic:blipFill>
+                  <pic:spPr bwMode="auto">
+                    <a:xfrm>
+                      <a:off x="0" y="0"/>
+                      <a:ext cx="5724525" cy="3686175"/>
+                    </a:xfrm>
+                    <a:prstGeom prst="rect">
+                      <a:avLst/>
+                    </a:prstGeom>
+                    <a:noFill/>
+                    <a:ln>
+                      <a:noFill/>
+                    </a:ln>
+                  </pic:spPr>
+                </pic:pic>
+              </a:graphicData>
+            </a:graphic>
+          </wp:inline>
+        </w:drawing>
+      </w:r>
+      <w:r>
+        <w:rPr>
+          <w:bCs/>
+          <w:noProof/>
+          <w:color w:val="auto"/>
+          <w:sz w:val="22"/>
+          <w:szCs w:val="22"/>
+        </w:rPr>
+        <w:drawing>
+          <wp:inline distT="0" distB="0" distL="0" distR="0" wp14:anchorId="429E413C" wp14:editId="4C397F80">
+            <wp:extent cx="5724525" cy="3819525"/>
+            <wp:effectExtent l="0" t="0" r="9525" b="9525"/>
+            <wp:docPr id="1213643209" name="Picture 1"/>
+            <wp:cNvGraphicFramePr>
+              <a:graphicFrameLocks xmlns:a="http://schemas.openxmlformats.org/drawingml/2006/main" noChangeAspect="1"/>
+            </wp:cNvGraphicFramePr>
+            <a:graphic xmlns:a="http://schemas.openxmlformats.org/drawingml/2006/main">
+              <a:graphicData uri="http://schemas.openxmlformats.org/drawingml/2006/picture">
+                <pic:pic xmlns:pic="http://schemas.openxmlformats.org/drawingml/2006/picture">
+                  <pic:nvPicPr>
+                    <pic:cNvPr id="0" name="Picture 1"/>
+                    <pic:cNvPicPr>
+                      <a:picLocks noChangeAspect="1" noChangeArrowheads="1"/>
+                    </pic:cNvPicPr>
+                  </pic:nvPicPr>
+                  <pic:blipFill>
+                    <a:blip r:embed="rId26">
+                      <a:extLst>
+                        <a:ext uri="{28A0092B-C50C-407E-A947-70E740481C1C}">
+                          <a14:useLocalDpi xmlns:a14="http://schemas.microsoft.com/office/drawing/2010/main" val="0"/>
+                        </a:ext>
+                      </a:extLst>
+                    </a:blip>
+                    <a:srcRect/>
+                    <a:stretch>
+                      <a:fillRect/>
+                    </a:stretch>
+                  </pic:blipFill>
+                  <pic:spPr bwMode="auto">
+                    <a:xfrm>
+                      <a:off x="0" y="0"/>
+                      <a:ext cx="5724525" cy="3819525"/>
+                    </a:xfrm>
+                    <a:prstGeom prst="rect">
+                      <a:avLst/>
+                    </a:prstGeom>
+                    <a:noFill/>
+                    <a:ln>
+                      <a:noFill/>
+                    </a:ln>
+                  </pic:spPr>
+                </pic:pic>
+              </a:graphicData>
+            </a:graphic>
+          </wp:inline>
+        </w:drawing>
+      </w:r>
+      <w:r>
+        <w:rPr>
+          <w:noProof/>
+        </w:rPr>
+        <w:t xml:space="preserve"> </w:t>
+      </w:r>
+    </w:p>
+    <w:p>
+      <w:pPr>
+        <w:pStyle w:val="Heading1"/>
+      </w:pPr>
+      <w:r>
+        <w:lastRenderedPageBreak/>
+        <w:t xml:space="preserve"> </w:t>
+      </w:r>
+      <w:r>
+        <w:t>[</w:t>
+      </w:r>
       <w:proofErr w:type="spellStart"/>
       <w:r>
         <w:t>WkX</w:t>
@@ -4637,52 +4952,6 @@
       <w:proofErr w:type="spellEnd"/>
       <w:r>
         <w:t>, XX] Challenge name here</w:t>
-      </w:r>
-    </w:p>
-    <w:p>
-      <w:pPr>
-        <w:pStyle w:val="Quote"/>
-      </w:pPr>
-      <w:r>
-        <w:t>Update the heading and insert the deliverable for this challenge. If you need subsections you can use Heading 2 or 3; don’t use Heading 1 again until the next challenge.</w:t>
-      </w:r>
-    </w:p>
-    <w:p>
-      <w:pPr>
-        <w:pStyle w:val="Quote"/>
-      </w:pPr>
-      <w:r>
-        <w:t>Remember the other guidance in the assignment page about formatting, inserting images, and other things.</w:t>
-      </w:r>
-    </w:p>
-    <w:p>
-      <w:pPr>
-        <w:pStyle w:val="Quote"/>
-      </w:pPr>
-      <w:r>
-        <w:t>Scope &amp; word count limit (or equivalent): Varies by challenge: see the challenge page.</w:t>
-      </w:r>
-    </w:p>
-    <w:p>
-      <w:pPr>
-        <w:pStyle w:val="Quote"/>
-      </w:pPr>
-      <w:r>
-        <w:t>Get ready for the next challenge by taking a copy of the heading from here (and optionally the purple text, but remember to remove it before submission).</w:t>
-      </w:r>
-    </w:p>
-    <w:p>
-      <w:r>
-        <w:t>[Insert the deliverable for this challenge here.]</w:t>
-      </w:r>
-    </w:p>
-    <w:p>
-      <w:pPr>
-        <w:pStyle w:val="Heading1"/>
-      </w:pPr>
-      <w:r>
-        <w:lastRenderedPageBreak/>
-        <w:t>[WkX, XX] Challenge name here</w:t>
       </w:r>
     </w:p>
     <w:p>
@@ -4818,7 +5087,7 @@
         </w:rPr>
         <w:t xml:space="preserve">Hollow Knight Wiki (2026) Available at: </w:t>
       </w:r>
-      <w:hyperlink r:id="rId25">
+      <w:hyperlink r:id="rId27">
         <w:r>
           <w:rPr>
             <w:rStyle w:val="Hyperlink"/>
@@ -4884,7 +5153,7 @@
         </w:rPr>
         <w:t xml:space="preserve"> September. Available at: </w:t>
       </w:r>
-      <w:hyperlink r:id="rId26">
+      <w:hyperlink r:id="rId28">
         <w:r>
           <w:rPr>
             <w:rStyle w:val="Hyperlink"/>
@@ -4920,8 +5189,8 @@
     <w:p/>
     <w:p/>
     <w:sectPr>
-      <w:headerReference w:type="default" r:id="rId27"/>
-      <w:footerReference w:type="default" r:id="rId28"/>
+      <w:headerReference w:type="default" r:id="rId29"/>
+      <w:footerReference w:type="default" r:id="rId30"/>
       <w:pgSz w:w="11906" w:h="16838"/>
       <w:pgMar w:top="1440" w:right="1440" w:bottom="1440" w:left="1440" w:header="708" w:footer="708" w:gutter="0"/>
       <w:pgNumType w:start="1"/>
@@ -7319,6 +7588,7 @@
   <w:style w:type="paragraph" w:default="1" w:styleId="Normal">
     <w:name w:val="Normal"/>
     <w:qFormat/>
+    <w:rsid w:val="007C2501"/>
     <w:pPr>
       <w:suppressAutoHyphens/>
     </w:pPr>
@@ -7440,6 +7710,7 @@
   <w:style w:type="character" w:customStyle="1" w:styleId="Heading1Char">
     <w:name w:val="Heading 1 Char"/>
     <w:basedOn w:val="DefaultParagraphFont"/>
+    <w:uiPriority w:val="9"/>
     <w:rPr>
       <w:rFonts w:ascii="Times New Roman" w:eastAsia="Times New Roman" w:hAnsi="Times New Roman" w:cs="Times New Roman"/>
       <w:bCs/>
@@ -8044,15 +8315,6 @@
 </file>
 
 <file path=customXml/item1.xml><?xml version="1.0" encoding="utf-8"?>
-<?mso-contentType ?>
-<FormTemplates xmlns="http://schemas.microsoft.com/sharepoint/v3/contenttype/forms">
-  <Display>DocumentLibraryForm</Display>
-  <Edit>DocumentLibraryForm</Edit>
-  <New>DocumentLibraryForm</New>
-</FormTemplates>
-</file>
-
-<file path=customXml/item2.xml><?xml version="1.0" encoding="utf-8"?>
 <ct:contentTypeSchema xmlns:ct="http://schemas.microsoft.com/office/2006/metadata/contentType" xmlns:ma="http://schemas.microsoft.com/office/2006/metadata/properties/metaAttributes" ct:_="" ma:_="" ma:contentTypeName="Document" ma:contentTypeID="0x010100D9F37D7A4EDC1040A880A2099F6664D1" ma:contentTypeVersion="17" ma:contentTypeDescription="Create a new document." ma:contentTypeScope="" ma:versionID="08efb0d5db8d1d6db33b2f38db1086d5">
   <xsd:schema xmlns:xsd="http://www.w3.org/2001/XMLSchema" xmlns:xs="http://www.w3.org/2001/XMLSchema" xmlns:p="http://schemas.microsoft.com/office/2006/metadata/properties" xmlns:ns2="8d4a1fdf-0f94-4e24-9675-6342052676c2" xmlns:ns3="e2a5ad16-c4e7-4aee-be6c-2d964216012c" xmlns:ns4="efc3e123-a60a-4a17-aaf1-487e28d9a3b3" targetNamespace="http://schemas.microsoft.com/office/2006/metadata/properties" ma:root="true" ma:fieldsID="8080e491b76ba13211cd04da0d5e9449" ns2:_="" ns3:_="" ns4:_="">
     <xsd:import namespace="8d4a1fdf-0f94-4e24-9675-6342052676c2"/>
@@ -8313,6 +8575,15 @@
 </ct:contentTypeSchema>
 </file>
 
+<file path=customXml/item2.xml><?xml version="1.0" encoding="utf-8"?>
+<?mso-contentType ?>
+<FormTemplates xmlns="http://schemas.microsoft.com/sharepoint/v3/contenttype/forms">
+  <Display>DocumentLibraryForm</Display>
+  <Edit>DocumentLibraryForm</Edit>
+  <New>DocumentLibraryForm</New>
+</FormTemplates>
+</file>
+
 <file path=customXml/item3.xml><?xml version="1.0" encoding="utf-8"?>
 <p:properties xmlns:p="http://schemas.microsoft.com/office/2006/metadata/properties" xmlns:xsi="http://www.w3.org/2001/XMLSchema-instance" xmlns:pc="http://schemas.microsoft.com/office/infopath/2007/PartnerControls">
   <documentManagement>
@@ -8329,14 +8600,6 @@
 </file>
 
 <file path=customXml/itemProps1.xml><?xml version="1.0" encoding="utf-8"?>
-<ds:datastoreItem xmlns:ds="http://schemas.openxmlformats.org/officeDocument/2006/customXml" ds:itemID="{0C9F64BE-1583-4619-A2B5-DACC1568FF50}">
-  <ds:schemaRefs>
-    <ds:schemaRef ds:uri="http://schemas.microsoft.com/sharepoint/v3/contenttype/forms"/>
-  </ds:schemaRefs>
-</ds:datastoreItem>
-</file>
-
-<file path=customXml/itemProps2.xml><?xml version="1.0" encoding="utf-8"?>
 <ds:datastoreItem xmlns:ds="http://schemas.openxmlformats.org/officeDocument/2006/customXml" ds:itemID="{277562E8-9AEC-4BC0-8DEC-73418E65CD9A}">
   <ds:schemaRefs>
     <ds:schemaRef ds:uri="http://schemas.microsoft.com/office/2006/metadata/contentType"/>
@@ -8352,6 +8615,14 @@
     <ds:schemaRef ds:uri="http://purl.org/dc/elements/1.1/"/>
     <ds:schemaRef ds:uri="http://purl.org/dc/terms/"/>
     <ds:schemaRef ds:uri="http://schemas.microsoft.com/internal/obd"/>
+  </ds:schemaRefs>
+</ds:datastoreItem>
+</file>
+
+<file path=customXml/itemProps2.xml><?xml version="1.0" encoding="utf-8"?>
+<ds:datastoreItem xmlns:ds="http://schemas.openxmlformats.org/officeDocument/2006/customXml" ds:itemID="{0C9F64BE-1583-4619-A2B5-DACC1568FF50}">
+  <ds:schemaRefs>
+    <ds:schemaRef ds:uri="http://schemas.microsoft.com/sharepoint/v3/contenttype/forms"/>
   </ds:schemaRefs>
 </ds:datastoreItem>
 </file>

</xml_diff>

<commit_message>
Uploaded screenshot 3 to version control playground challenge
</commit_message>
<xml_diff>
--- a/AsfG_Portfolio_2505087.docx
+++ b/AsfG_Portfolio_2505087.docx
@@ -4740,16 +4740,7 @@
       </w:pPr>
       <w:r>
         <w:lastRenderedPageBreak/>
-        <w:t>[Wk</w:t>
-      </w:r>
-      <w:r>
-        <w:t>5, LO4</w:t>
-      </w:r>
-      <w:r>
-        <w:t xml:space="preserve">] </w:t>
-      </w:r>
-      <w:r>
-        <w:t>Mystery Photo!</w:t>
+        <w:t>[Wk5, LO4] Mystery Photo!</w:t>
       </w:r>
     </w:p>
     <w:p>
@@ -4795,27 +4786,15 @@
       </w:pPr>
       <w:r>
         <w:lastRenderedPageBreak/>
-        <w:t>[Wk</w:t>
-      </w:r>
-      <w:r>
-        <w:t>6</w:t>
-      </w:r>
-      <w:r>
-        <w:t xml:space="preserve">, </w:t>
-      </w:r>
-      <w:r>
-        <w:t>LO4</w:t>
-      </w:r>
-      <w:r>
-        <w:t xml:space="preserve">] </w:t>
-      </w:r>
-      <w:r>
-        <w:t>Version Control Playground</w:t>
+        <w:t>[Wk6, LO4] Version Control Playground</w:t>
       </w:r>
     </w:p>
     <w:p>
       <w:pPr>
         <w:pStyle w:val="Quote"/>
+        <w:rPr>
+          <w:noProof/>
+        </w:rPr>
       </w:pPr>
       <w:r>
         <w:rPr>
@@ -4927,11 +4906,45 @@
           </wp:inline>
         </w:drawing>
       </w:r>
-      <w:r>
-        <w:rPr>
-          <w:noProof/>
-        </w:rPr>
-        <w:t xml:space="preserve"> </w:t>
+    </w:p>
+    <w:p>
+      <w:r>
+        <w:lastRenderedPageBreak/>
+        <w:drawing>
+          <wp:inline distT="0" distB="0" distL="0" distR="0" wp14:anchorId="3D71A24E" wp14:editId="395125BB">
+            <wp:extent cx="5731510" cy="3503295"/>
+            <wp:effectExtent l="0" t="0" r="2540" b="1905"/>
+            <wp:docPr id="969526797" name="Picture 1"/>
+            <wp:cNvGraphicFramePr>
+              <a:graphicFrameLocks xmlns:a="http://schemas.openxmlformats.org/drawingml/2006/main" noChangeAspect="1"/>
+            </wp:cNvGraphicFramePr>
+            <a:graphic xmlns:a="http://schemas.openxmlformats.org/drawingml/2006/main">
+              <a:graphicData uri="http://schemas.openxmlformats.org/drawingml/2006/picture">
+                <pic:pic xmlns:pic="http://schemas.openxmlformats.org/drawingml/2006/picture">
+                  <pic:nvPicPr>
+                    <pic:cNvPr id="969526797" name=""/>
+                    <pic:cNvPicPr/>
+                  </pic:nvPicPr>
+                  <pic:blipFill>
+                    <a:blip r:embed="rId27"/>
+                    <a:stretch>
+                      <a:fillRect/>
+                    </a:stretch>
+                  </pic:blipFill>
+                  <pic:spPr>
+                    <a:xfrm>
+                      <a:off x="0" y="0"/>
+                      <a:ext cx="5731510" cy="3503295"/>
+                    </a:xfrm>
+                    <a:prstGeom prst="rect">
+                      <a:avLst/>
+                    </a:prstGeom>
+                  </pic:spPr>
+                </pic:pic>
+              </a:graphicData>
+            </a:graphic>
+          </wp:inline>
+        </w:drawing>
       </w:r>
     </w:p>
     <w:p>
@@ -4940,10 +4953,7 @@
       </w:pPr>
       <w:r>
         <w:lastRenderedPageBreak/>
-        <w:t xml:space="preserve"> </w:t>
-      </w:r>
-      <w:r>
-        <w:t>[</w:t>
+        <w:t xml:space="preserve"> [</w:t>
       </w:r>
       <w:proofErr w:type="spellStart"/>
       <w:r>
@@ -5087,7 +5097,7 @@
         </w:rPr>
         <w:t xml:space="preserve">Hollow Knight Wiki (2026) Available at: </w:t>
       </w:r>
-      <w:hyperlink r:id="rId27">
+      <w:hyperlink r:id="rId28">
         <w:r>
           <w:rPr>
             <w:rStyle w:val="Hyperlink"/>
@@ -5153,7 +5163,7 @@
         </w:rPr>
         <w:t xml:space="preserve"> September. Available at: </w:t>
       </w:r>
-      <w:hyperlink r:id="rId28">
+      <w:hyperlink r:id="rId29">
         <w:r>
           <w:rPr>
             <w:rStyle w:val="Hyperlink"/>
@@ -5189,8 +5199,8 @@
     <w:p/>
     <w:p/>
     <w:sectPr>
-      <w:headerReference w:type="default" r:id="rId29"/>
-      <w:footerReference w:type="default" r:id="rId30"/>
+      <w:headerReference w:type="default" r:id="rId30"/>
+      <w:footerReference w:type="default" r:id="rId31"/>
       <w:pgSz w:w="11906" w:h="16838"/>
       <w:pgMar w:top="1440" w:right="1440" w:bottom="1440" w:left="1440" w:header="708" w:footer="708" w:gutter="0"/>
       <w:pgNumType w:start="1"/>
@@ -8315,6 +8325,15 @@
 </file>
 
 <file path=customXml/item1.xml><?xml version="1.0" encoding="utf-8"?>
+<?mso-contentType ?>
+<FormTemplates xmlns="http://schemas.microsoft.com/sharepoint/v3/contenttype/forms">
+  <Display>DocumentLibraryForm</Display>
+  <Edit>DocumentLibraryForm</Edit>
+  <New>DocumentLibraryForm</New>
+</FormTemplates>
+</file>
+
+<file path=customXml/item2.xml><?xml version="1.0" encoding="utf-8"?>
 <ct:contentTypeSchema xmlns:ct="http://schemas.microsoft.com/office/2006/metadata/contentType" xmlns:ma="http://schemas.microsoft.com/office/2006/metadata/properties/metaAttributes" ct:_="" ma:_="" ma:contentTypeName="Document" ma:contentTypeID="0x010100D9F37D7A4EDC1040A880A2099F6664D1" ma:contentTypeVersion="17" ma:contentTypeDescription="Create a new document." ma:contentTypeScope="" ma:versionID="08efb0d5db8d1d6db33b2f38db1086d5">
   <xsd:schema xmlns:xsd="http://www.w3.org/2001/XMLSchema" xmlns:xs="http://www.w3.org/2001/XMLSchema" xmlns:p="http://schemas.microsoft.com/office/2006/metadata/properties" xmlns:ns2="8d4a1fdf-0f94-4e24-9675-6342052676c2" xmlns:ns3="e2a5ad16-c4e7-4aee-be6c-2d964216012c" xmlns:ns4="efc3e123-a60a-4a17-aaf1-487e28d9a3b3" targetNamespace="http://schemas.microsoft.com/office/2006/metadata/properties" ma:root="true" ma:fieldsID="8080e491b76ba13211cd04da0d5e9449" ns2:_="" ns3:_="" ns4:_="">
     <xsd:import namespace="8d4a1fdf-0f94-4e24-9675-6342052676c2"/>
@@ -8575,15 +8594,6 @@
 </ct:contentTypeSchema>
 </file>
 
-<file path=customXml/item2.xml><?xml version="1.0" encoding="utf-8"?>
-<?mso-contentType ?>
-<FormTemplates xmlns="http://schemas.microsoft.com/sharepoint/v3/contenttype/forms">
-  <Display>DocumentLibraryForm</Display>
-  <Edit>DocumentLibraryForm</Edit>
-  <New>DocumentLibraryForm</New>
-</FormTemplates>
-</file>
-
 <file path=customXml/item3.xml><?xml version="1.0" encoding="utf-8"?>
 <p:properties xmlns:p="http://schemas.microsoft.com/office/2006/metadata/properties" xmlns:xsi="http://www.w3.org/2001/XMLSchema-instance" xmlns:pc="http://schemas.microsoft.com/office/infopath/2007/PartnerControls">
   <documentManagement>
@@ -8600,6 +8610,14 @@
 </file>
 
 <file path=customXml/itemProps1.xml><?xml version="1.0" encoding="utf-8"?>
+<ds:datastoreItem xmlns:ds="http://schemas.openxmlformats.org/officeDocument/2006/customXml" ds:itemID="{0C9F64BE-1583-4619-A2B5-DACC1568FF50}">
+  <ds:schemaRefs>
+    <ds:schemaRef ds:uri="http://schemas.microsoft.com/sharepoint/v3/contenttype/forms"/>
+  </ds:schemaRefs>
+</ds:datastoreItem>
+</file>
+
+<file path=customXml/itemProps2.xml><?xml version="1.0" encoding="utf-8"?>
 <ds:datastoreItem xmlns:ds="http://schemas.openxmlformats.org/officeDocument/2006/customXml" ds:itemID="{277562E8-9AEC-4BC0-8DEC-73418E65CD9A}">
   <ds:schemaRefs>
     <ds:schemaRef ds:uri="http://schemas.microsoft.com/office/2006/metadata/contentType"/>
@@ -8615,14 +8633,6 @@
     <ds:schemaRef ds:uri="http://purl.org/dc/elements/1.1/"/>
     <ds:schemaRef ds:uri="http://purl.org/dc/terms/"/>
     <ds:schemaRef ds:uri="http://schemas.microsoft.com/internal/obd"/>
-  </ds:schemaRefs>
-</ds:datastoreItem>
-</file>
-
-<file path=customXml/itemProps2.xml><?xml version="1.0" encoding="utf-8"?>
-<ds:datastoreItem xmlns:ds="http://schemas.openxmlformats.org/officeDocument/2006/customXml" ds:itemID="{0C9F64BE-1583-4619-A2B5-DACC1568FF50}">
-  <ds:schemaRefs>
-    <ds:schemaRef ds:uri="http://schemas.microsoft.com/sharepoint/v3/contenttype/forms"/>
   </ds:schemaRefs>
 </ds:datastoreItem>
 </file>

</xml_diff>

<commit_message>
Finished week 5 timetable challenge
</commit_message>
<xml_diff>
--- a/AsfG_Portfolio_2505087.docx
+++ b/AsfG_Portfolio_2505087.docx
@@ -4639,42 +4639,51 @@
       <w:r>
         <w:t>Weekly Timetable</w:t>
       </w:r>
-    </w:p>
-    <w:p>
-      <w:pPr>
-        <w:pStyle w:val="Quote"/>
-      </w:pPr>
-      <w:r>
-        <w:t>Update the heading and insert the deliverable for this challenge. If you need subsections you can use Heading 2 or 3; don’t use Heading 1 again until the next challenge.</w:t>
-      </w:r>
-    </w:p>
-    <w:p>
-      <w:pPr>
-        <w:pStyle w:val="Quote"/>
-      </w:pPr>
-      <w:r>
-        <w:t>Remember the other guidance in the assignment page about formatting, inserting images, and other things.</w:t>
-      </w:r>
-    </w:p>
-    <w:p>
-      <w:pPr>
-        <w:pStyle w:val="Quote"/>
-      </w:pPr>
-      <w:r>
-        <w:t>Scope &amp; word count limit (or equivalent): Varies by challenge: see the challenge page.</w:t>
-      </w:r>
-    </w:p>
-    <w:p>
-      <w:pPr>
-        <w:pStyle w:val="Quote"/>
-      </w:pPr>
-      <w:r>
-        <w:t>Get ready for the next challenge by taking a copy of the heading from here (and optionally the purple text, but remember to remove it before submission).</w:t>
-      </w:r>
-    </w:p>
-    <w:p>
-      <w:r>
-        <w:t>[Insert the deliverable for this challenge here.]</w:t>
+      <w:r>
+        <w:rPr>
+          <w:rFonts w:eastAsia="Calibri"/>
+          <w:bCs w:val="0"/>
+          <w:i/>
+          <w:iCs/>
+          <w:color w:val="5F497A"/>
+          <w:sz w:val="24"/>
+          <w:szCs w:val="24"/>
+        </w:rPr>
+        <w:drawing>
+          <wp:inline distT="0" distB="0" distL="0" distR="0" wp14:anchorId="5E17387E" wp14:editId="59393397">
+            <wp:extent cx="5800725" cy="4114363"/>
+            <wp:effectExtent l="0" t="0" r="0" b="635"/>
+            <wp:docPr id="1532361135" name="Picture 1"/>
+            <wp:cNvGraphicFramePr>
+              <a:graphicFrameLocks xmlns:a="http://schemas.openxmlformats.org/drawingml/2006/main" noChangeAspect="1"/>
+            </wp:cNvGraphicFramePr>
+            <a:graphic xmlns:a="http://schemas.openxmlformats.org/drawingml/2006/main">
+              <a:graphicData uri="http://schemas.openxmlformats.org/drawingml/2006/picture">
+                <pic:pic xmlns:pic="http://schemas.openxmlformats.org/drawingml/2006/picture">
+                  <pic:nvPicPr>
+                    <pic:cNvPr id="1532361135" name=""/>
+                    <pic:cNvPicPr/>
+                  </pic:nvPicPr>
+                  <pic:blipFill>
+                    <a:blip r:embed="rId25"/>
+                    <a:stretch>
+                      <a:fillRect/>
+                    </a:stretch>
+                  </pic:blipFill>
+                  <pic:spPr>
+                    <a:xfrm>
+                      <a:off x="0" y="0"/>
+                      <a:ext cx="5801916" cy="4115208"/>
+                    </a:xfrm>
+                    <a:prstGeom prst="rect">
+                      <a:avLst/>
+                    </a:prstGeom>
+                  </pic:spPr>
+                </pic:pic>
+              </a:graphicData>
+            </a:graphic>
+          </wp:inline>
+        </w:drawing>
       </w:r>
     </w:p>
     <w:p>
@@ -4818,7 +4827,7 @@
                     </pic:cNvPicPr>
                   </pic:nvPicPr>
                   <pic:blipFill>
-                    <a:blip r:embed="rId25">
+                    <a:blip r:embed="rId26">
                       <a:extLst>
                         <a:ext uri="{28A0092B-C50C-407E-A947-70E740481C1C}">
                           <a14:useLocalDpi xmlns:a14="http://schemas.microsoft.com/office/drawing/2010/main" val="0"/>
@@ -4875,7 +4884,7 @@
                     </pic:cNvPicPr>
                   </pic:nvPicPr>
                   <pic:blipFill>
-                    <a:blip r:embed="rId26">
+                    <a:blip r:embed="rId27">
                       <a:extLst>
                         <a:ext uri="{28A0092B-C50C-407E-A947-70E740481C1C}">
                           <a14:useLocalDpi xmlns:a14="http://schemas.microsoft.com/office/drawing/2010/main" val="0"/>
@@ -4909,6 +4918,9 @@
     </w:p>
     <w:p>
       <w:r>
+        <w:rPr>
+          <w:noProof/>
+        </w:rPr>
         <w:lastRenderedPageBreak/>
         <w:drawing>
           <wp:inline distT="0" distB="0" distL="0" distR="0" wp14:anchorId="3D71A24E" wp14:editId="395125BB">
@@ -4926,7 +4938,7 @@
                     <pic:cNvPicPr/>
                   </pic:nvPicPr>
                   <pic:blipFill>
-                    <a:blip r:embed="rId27"/>
+                    <a:blip r:embed="rId28"/>
                     <a:stretch>
                       <a:fillRect/>
                     </a:stretch>
@@ -5097,7 +5109,7 @@
         </w:rPr>
         <w:t xml:space="preserve">Hollow Knight Wiki (2026) Available at: </w:t>
       </w:r>
-      <w:hyperlink r:id="rId28">
+      <w:hyperlink r:id="rId29">
         <w:r>
           <w:rPr>
             <w:rStyle w:val="Hyperlink"/>
@@ -5163,7 +5175,7 @@
         </w:rPr>
         <w:t xml:space="preserve"> September. Available at: </w:t>
       </w:r>
-      <w:hyperlink r:id="rId29">
+      <w:hyperlink r:id="rId30">
         <w:r>
           <w:rPr>
             <w:rStyle w:val="Hyperlink"/>
@@ -5199,8 +5211,8 @@
     <w:p/>
     <w:p/>
     <w:sectPr>
-      <w:headerReference w:type="default" r:id="rId30"/>
-      <w:footerReference w:type="default" r:id="rId31"/>
+      <w:headerReference w:type="default" r:id="rId31"/>
+      <w:footerReference w:type="default" r:id="rId32"/>
       <w:pgSz w:w="11906" w:h="16838"/>
       <w:pgMar w:top="1440" w:right="1440" w:bottom="1440" w:left="1440" w:header="708" w:footer="708" w:gutter="0"/>
       <w:pgNumType w:start="1"/>
@@ -7665,7 +7677,6 @@
   <w:style w:type="character" w:default="1" w:styleId="DefaultParagraphFont">
     <w:name w:val="Default Paragraph Font"/>
     <w:uiPriority w:val="1"/>
-    <w:semiHidden/>
     <w:unhideWhenUsed/>
   </w:style>
   <w:style w:type="table" w:default="1" w:styleId="TableNormal">
@@ -8325,15 +8336,6 @@
 </file>
 
 <file path=customXml/item1.xml><?xml version="1.0" encoding="utf-8"?>
-<?mso-contentType ?>
-<FormTemplates xmlns="http://schemas.microsoft.com/sharepoint/v3/contenttype/forms">
-  <Display>DocumentLibraryForm</Display>
-  <Edit>DocumentLibraryForm</Edit>
-  <New>DocumentLibraryForm</New>
-</FormTemplates>
-</file>
-
-<file path=customXml/item2.xml><?xml version="1.0" encoding="utf-8"?>
 <ct:contentTypeSchema xmlns:ct="http://schemas.microsoft.com/office/2006/metadata/contentType" xmlns:ma="http://schemas.microsoft.com/office/2006/metadata/properties/metaAttributes" ct:_="" ma:_="" ma:contentTypeName="Document" ma:contentTypeID="0x010100D9F37D7A4EDC1040A880A2099F6664D1" ma:contentTypeVersion="17" ma:contentTypeDescription="Create a new document." ma:contentTypeScope="" ma:versionID="08efb0d5db8d1d6db33b2f38db1086d5">
   <xsd:schema xmlns:xsd="http://www.w3.org/2001/XMLSchema" xmlns:xs="http://www.w3.org/2001/XMLSchema" xmlns:p="http://schemas.microsoft.com/office/2006/metadata/properties" xmlns:ns2="8d4a1fdf-0f94-4e24-9675-6342052676c2" xmlns:ns3="e2a5ad16-c4e7-4aee-be6c-2d964216012c" xmlns:ns4="efc3e123-a60a-4a17-aaf1-487e28d9a3b3" targetNamespace="http://schemas.microsoft.com/office/2006/metadata/properties" ma:root="true" ma:fieldsID="8080e491b76ba13211cd04da0d5e9449" ns2:_="" ns3:_="" ns4:_="">
     <xsd:import namespace="8d4a1fdf-0f94-4e24-9675-6342052676c2"/>
@@ -8594,6 +8596,15 @@
 </ct:contentTypeSchema>
 </file>
 
+<file path=customXml/item2.xml><?xml version="1.0" encoding="utf-8"?>
+<?mso-contentType ?>
+<FormTemplates xmlns="http://schemas.microsoft.com/sharepoint/v3/contenttype/forms">
+  <Display>DocumentLibraryForm</Display>
+  <Edit>DocumentLibraryForm</Edit>
+  <New>DocumentLibraryForm</New>
+</FormTemplates>
+</file>
+
 <file path=customXml/item3.xml><?xml version="1.0" encoding="utf-8"?>
 <p:properties xmlns:p="http://schemas.microsoft.com/office/2006/metadata/properties" xmlns:xsi="http://www.w3.org/2001/XMLSchema-instance" xmlns:pc="http://schemas.microsoft.com/office/infopath/2007/PartnerControls">
   <documentManagement>
@@ -8610,14 +8621,6 @@
 </file>
 
 <file path=customXml/itemProps1.xml><?xml version="1.0" encoding="utf-8"?>
-<ds:datastoreItem xmlns:ds="http://schemas.openxmlformats.org/officeDocument/2006/customXml" ds:itemID="{0C9F64BE-1583-4619-A2B5-DACC1568FF50}">
-  <ds:schemaRefs>
-    <ds:schemaRef ds:uri="http://schemas.microsoft.com/sharepoint/v3/contenttype/forms"/>
-  </ds:schemaRefs>
-</ds:datastoreItem>
-</file>
-
-<file path=customXml/itemProps2.xml><?xml version="1.0" encoding="utf-8"?>
 <ds:datastoreItem xmlns:ds="http://schemas.openxmlformats.org/officeDocument/2006/customXml" ds:itemID="{277562E8-9AEC-4BC0-8DEC-73418E65CD9A}">
   <ds:schemaRefs>
     <ds:schemaRef ds:uri="http://schemas.microsoft.com/office/2006/metadata/contentType"/>
@@ -8633,6 +8636,14 @@
     <ds:schemaRef ds:uri="http://purl.org/dc/elements/1.1/"/>
     <ds:schemaRef ds:uri="http://purl.org/dc/terms/"/>
     <ds:schemaRef ds:uri="http://schemas.microsoft.com/internal/obd"/>
+  </ds:schemaRefs>
+</ds:datastoreItem>
+</file>
+
+<file path=customXml/itemProps2.xml><?xml version="1.0" encoding="utf-8"?>
+<ds:datastoreItem xmlns:ds="http://schemas.openxmlformats.org/officeDocument/2006/customXml" ds:itemID="{0C9F64BE-1583-4619-A2B5-DACC1568FF50}">
+  <ds:schemaRefs>
+    <ds:schemaRef ds:uri="http://schemas.microsoft.com/sharepoint/v3/contenttype/forms"/>
   </ds:schemaRefs>
 </ds:datastoreItem>
 </file>

</xml_diff>

<commit_message>
Finished week 5 Timeline Diagram challenge
</commit_message>
<xml_diff>
--- a/AsfG_Portfolio_2505087.docx
+++ b/AsfG_Portfolio_2505087.docx
@@ -1614,12 +1614,10 @@
         <w:t xml:space="preserve"> Look after </w:t>
       </w:r>
       <w:bookmarkStart w:id="8" w:name="_Int_VptHzPn5"/>
-      <w:proofErr w:type="gramStart"/>
       <w:r>
         <w:t>myself</w:t>
       </w:r>
       <w:bookmarkEnd w:id="8"/>
-      <w:proofErr w:type="gramEnd"/>
       <w:r>
         <w:t>; eat, drink responsibly; keep a good work/life balance</w:t>
       </w:r>
@@ -2278,15 +2276,8 @@
       <w:r>
         <w:t xml:space="preserve">t in </w:t>
       </w:r>
-      <w:proofErr w:type="spellStart"/>
-      <w:proofErr w:type="gramStart"/>
-      <w:r>
-        <w:t>it’s</w:t>
-      </w:r>
-      <w:proofErr w:type="spellEnd"/>
-      <w:proofErr w:type="gramEnd"/>
-      <w:r>
-        <w:t xml:space="preserve"> </w:t>
+      <w:r>
+        <w:t xml:space="preserve">it’s </w:t>
       </w:r>
       <w:r>
         <w:t>creat</w:t>
@@ -2833,15 +2824,7 @@
     </w:p>
     <w:p>
       <w:r>
-        <w:t xml:space="preserve">To excel in this role, an artist must have an extensive understanding of human anatomy, a strong foundation in artistic principles, including form, structure, colour theory and lighting; and the ability to adeptly use industry-standard software tools for character creation including </w:t>
-      </w:r>
-      <w:proofErr w:type="spellStart"/>
-      <w:r>
-        <w:t>ZBrush</w:t>
-      </w:r>
-      <w:proofErr w:type="spellEnd"/>
-      <w:r>
-        <w:t>, Maya and the Substance Suite.</w:t>
+        <w:t>To excel in this role, an artist must have an extensive understanding of human anatomy, a strong foundation in artistic principles, including form, structure, colour theory and lighting; and the ability to adeptly use industry-standard software tools for character creation including ZBrush, Maya and the Substance Suite.</w:t>
       </w:r>
     </w:p>
     <w:p>
@@ -2939,15 +2922,7 @@
         </w:numPr>
       </w:pPr>
       <w:r>
-        <w:t xml:space="preserve">Continuously improve artistic skills and stay </w:t>
-      </w:r>
-      <w:proofErr w:type="gramStart"/>
-      <w:r>
-        <w:t>up-to-date</w:t>
-      </w:r>
-      <w:proofErr w:type="gramEnd"/>
-      <w:r>
-        <w:t xml:space="preserve"> with the latest industry trends and techniques.</w:t>
+        <w:t>Continuously improve artistic skills and stay up-to-date with the latest industry trends and techniques.</w:t>
       </w:r>
     </w:p>
     <w:p>
@@ -2978,15 +2953,7 @@
         </w:numPr>
       </w:pPr>
       <w:r>
-        <w:t xml:space="preserve">Strong skills in 3D modelling, sculpting, and texturing using industry-standard software, such as </w:t>
-      </w:r>
-      <w:proofErr w:type="spellStart"/>
-      <w:r>
-        <w:t>ZBrush</w:t>
-      </w:r>
-      <w:proofErr w:type="spellEnd"/>
-      <w:r>
-        <w:t>, Maya, and Substance Painter.</w:t>
+        <w:t>Strong skills in 3D modelling, sculpting, and texturing using industry-standard software, such as ZBrush, Maya, and Substance Painter.</w:t>
       </w:r>
     </w:p>
     <w:p>
@@ -3140,15 +3107,7 @@
         </w:numPr>
       </w:pPr>
       <w:r>
-        <w:t xml:space="preserve">Effectively use and adapt </w:t>
-      </w:r>
-      <w:proofErr w:type="spellStart"/>
-      <w:r>
-        <w:t>Megascans</w:t>
-      </w:r>
-      <w:proofErr w:type="spellEnd"/>
-      <w:r>
-        <w:t xml:space="preserve"> and other photogrammetry assets and textures</w:t>
+        <w:t>Effectively use and adapt Megascans and other photogrammetry assets and textures</w:t>
       </w:r>
     </w:p>
     <w:p>
@@ -3170,15 +3129,7 @@
         </w:numPr>
       </w:pPr>
       <w:r>
-        <w:t xml:space="preserve">Stay </w:t>
-      </w:r>
-      <w:proofErr w:type="gramStart"/>
-      <w:r>
-        <w:t>up-to-date</w:t>
-      </w:r>
-      <w:proofErr w:type="gramEnd"/>
-      <w:r>
-        <w:t xml:space="preserve"> on industry trends, tools, and best practices to continually improve the quality and efficiency of your work</w:t>
+        <w:t>Stay up-to-date on industry trends, tools, and best practices to continually improve the quality and efficiency of your work</w:t>
       </w:r>
     </w:p>
     <w:p>
@@ -3220,15 +3171,7 @@
         </w:numPr>
       </w:pPr>
       <w:r>
-        <w:t xml:space="preserve">Skilled in creating PBR materials using Substance Painter, Substance Designer or </w:t>
-      </w:r>
-      <w:proofErr w:type="spellStart"/>
-      <w:r>
-        <w:t>Quixel</w:t>
-      </w:r>
-      <w:proofErr w:type="spellEnd"/>
-      <w:r>
-        <w:t xml:space="preserve"> Mixer</w:t>
+        <w:t>Skilled in creating PBR materials using Substance Painter, Substance Designer or Quixel Mixer</w:t>
       </w:r>
     </w:p>
     <w:p>
@@ -3282,13 +3225,8 @@
       </w:pPr>
       <w:r>
         <w:lastRenderedPageBreak/>
-        <w:t xml:space="preserve">Experience with world-building tools such as World Machine, Houdini, or </w:t>
-      </w:r>
-      <w:proofErr w:type="spellStart"/>
-      <w:r>
-        <w:t>SpeedTree</w:t>
-      </w:r>
-      <w:proofErr w:type="spellEnd"/>
+        <w:t>Experience with world-building tools such as World Machine, Houdini, or SpeedTree</w:t>
+      </w:r>
     </w:p>
     <w:p>
       <w:pPr>
@@ -3309,15 +3247,7 @@
         </w:numPr>
       </w:pPr>
       <w:r>
-        <w:t xml:space="preserve">Experience with </w:t>
-      </w:r>
-      <w:proofErr w:type="spellStart"/>
-      <w:r>
-        <w:t>ZBrush</w:t>
-      </w:r>
-      <w:proofErr w:type="spellEnd"/>
-      <w:r>
-        <w:t xml:space="preserve"> or other sculpting tools</w:t>
+        <w:t>Experience with ZBrush or other sculpting tools</w:t>
       </w:r>
     </w:p>
     <w:p>
@@ -3740,12 +3670,10 @@
         <w:t xml:space="preserve">Climax studios itself </w:t>
       </w:r>
       <w:bookmarkStart w:id="9" w:name="_Int_O8UgZ3AS"/>
-      <w:proofErr w:type="gramStart"/>
       <w:r>
         <w:t>appeals</w:t>
       </w:r>
       <w:bookmarkEnd w:id="9"/>
-      <w:proofErr w:type="gramEnd"/>
       <w:r>
         <w:t xml:space="preserve"> to me </w:t>
       </w:r>
@@ -4463,15 +4391,7 @@
               <w:t xml:space="preserve"> representing </w:t>
             </w:r>
             <w:r>
-              <w:t xml:space="preserve">the environment in an </w:t>
-            </w:r>
-            <w:proofErr w:type="gramStart"/>
-            <w:r>
-              <w:t>easy to understand</w:t>
-            </w:r>
-            <w:proofErr w:type="gramEnd"/>
-            <w:r>
-              <w:t xml:space="preserve"> way so that the player </w:t>
+              <w:t xml:space="preserve">the environment in an easy to understand way so that the player </w:t>
             </w:r>
             <w:r>
               <w:t xml:space="preserve">always </w:t>
@@ -4705,40 +4625,42 @@
       </w:r>
     </w:p>
     <w:p>
-      <w:pPr>
-        <w:pStyle w:val="Quote"/>
-      </w:pPr>
-      <w:r>
-        <w:t>Update the heading and insert the deliverable for this challenge. If you need subsections you can use Heading 2 or 3; don’t use Heading 1 again until the next challenge.</w:t>
-      </w:r>
-    </w:p>
-    <w:p>
-      <w:pPr>
-        <w:pStyle w:val="Quote"/>
-      </w:pPr>
-      <w:r>
-        <w:t>Remember the other guidance in the assignment page about formatting, inserting images, and other things.</w:t>
-      </w:r>
-    </w:p>
-    <w:p>
-      <w:pPr>
-        <w:pStyle w:val="Quote"/>
-      </w:pPr>
-      <w:r>
-        <w:t>Scope &amp; word count limit (or equivalent): Varies by challenge: see the challenge page.</w:t>
-      </w:r>
-    </w:p>
-    <w:p>
-      <w:pPr>
-        <w:pStyle w:val="Quote"/>
-      </w:pPr>
-      <w:r>
-        <w:t>Get ready for the next challenge by taking a copy of the heading from here (and optionally the purple text, but remember to remove it before submission).</w:t>
-      </w:r>
-    </w:p>
-    <w:p>
-      <w:r>
-        <w:t>[Insert the deliverable for this challenge here.]</w:t>
+      <w:r>
+        <w:drawing>
+          <wp:inline distT="0" distB="0" distL="0" distR="0" wp14:anchorId="1D4486CF" wp14:editId="298B6BF0">
+            <wp:extent cx="5731510" cy="4197985"/>
+            <wp:effectExtent l="0" t="0" r="2540" b="0"/>
+            <wp:docPr id="771462452" name="Picture 1"/>
+            <wp:cNvGraphicFramePr>
+              <a:graphicFrameLocks xmlns:a="http://schemas.openxmlformats.org/drawingml/2006/main" noChangeAspect="1"/>
+            </wp:cNvGraphicFramePr>
+            <a:graphic xmlns:a="http://schemas.openxmlformats.org/drawingml/2006/main">
+              <a:graphicData uri="http://schemas.openxmlformats.org/drawingml/2006/picture">
+                <pic:pic xmlns:pic="http://schemas.openxmlformats.org/drawingml/2006/picture">
+                  <pic:nvPicPr>
+                    <pic:cNvPr id="771462452" name=""/>
+                    <pic:cNvPicPr/>
+                  </pic:nvPicPr>
+                  <pic:blipFill>
+                    <a:blip r:embed="rId26"/>
+                    <a:stretch>
+                      <a:fillRect/>
+                    </a:stretch>
+                  </pic:blipFill>
+                  <pic:spPr>
+                    <a:xfrm>
+                      <a:off x="0" y="0"/>
+                      <a:ext cx="5731510" cy="4197985"/>
+                    </a:xfrm>
+                    <a:prstGeom prst="rect">
+                      <a:avLst/>
+                    </a:prstGeom>
+                  </pic:spPr>
+                </pic:pic>
+              </a:graphicData>
+            </a:graphic>
+          </wp:inline>
+        </w:drawing>
       </w:r>
     </w:p>
     <w:p/>
@@ -4827,7 +4749,7 @@
                     </pic:cNvPicPr>
                   </pic:nvPicPr>
                   <pic:blipFill>
-                    <a:blip r:embed="rId26">
+                    <a:blip r:embed="rId27">
                       <a:extLst>
                         <a:ext uri="{28A0092B-C50C-407E-A947-70E740481C1C}">
                           <a14:useLocalDpi xmlns:a14="http://schemas.microsoft.com/office/drawing/2010/main" val="0"/>
@@ -4884,7 +4806,7 @@
                     </pic:cNvPicPr>
                   </pic:nvPicPr>
                   <pic:blipFill>
-                    <a:blip r:embed="rId27">
+                    <a:blip r:embed="rId28">
                       <a:extLst>
                         <a:ext uri="{28A0092B-C50C-407E-A947-70E740481C1C}">
                           <a14:useLocalDpi xmlns:a14="http://schemas.microsoft.com/office/drawing/2010/main" val="0"/>
@@ -4938,7 +4860,7 @@
                     <pic:cNvPicPr/>
                   </pic:nvPicPr>
                   <pic:blipFill>
-                    <a:blip r:embed="rId28"/>
+                    <a:blip r:embed="rId29"/>
                     <a:stretch>
                       <a:fillRect/>
                     </a:stretch>
@@ -4965,15 +4887,7 @@
       </w:pPr>
       <w:r>
         <w:lastRenderedPageBreak/>
-        <w:t xml:space="preserve"> [</w:t>
-      </w:r>
-      <w:proofErr w:type="spellStart"/>
-      <w:r>
-        <w:t>WkX</w:t>
-      </w:r>
-      <w:proofErr w:type="spellEnd"/>
-      <w:r>
-        <w:t>, XX] Challenge name here</w:t>
+        <w:t xml:space="preserve"> [WkX, XX] Challenge name here</w:t>
       </w:r>
     </w:p>
     <w:p>
@@ -5109,7 +5023,7 @@
         </w:rPr>
         <w:t xml:space="preserve">Hollow Knight Wiki (2026) Available at: </w:t>
       </w:r>
-      <w:hyperlink r:id="rId29">
+      <w:hyperlink r:id="rId30">
         <w:r>
           <w:rPr>
             <w:rStyle w:val="Hyperlink"/>
@@ -5175,7 +5089,7 @@
         </w:rPr>
         <w:t xml:space="preserve"> September. Available at: </w:t>
       </w:r>
-      <w:hyperlink r:id="rId30">
+      <w:hyperlink r:id="rId31">
         <w:r>
           <w:rPr>
             <w:rStyle w:val="Hyperlink"/>
@@ -5211,8 +5125,8 @@
     <w:p/>
     <w:p/>
     <w:sectPr>
-      <w:headerReference w:type="default" r:id="rId31"/>
-      <w:footerReference w:type="default" r:id="rId32"/>
+      <w:headerReference w:type="default" r:id="rId32"/>
+      <w:footerReference w:type="default" r:id="rId33"/>
       <w:pgSz w:w="11906" w:h="16838"/>
       <w:pgMar w:top="1440" w:right="1440" w:bottom="1440" w:left="1440" w:header="708" w:footer="708" w:gutter="0"/>
       <w:pgNumType w:start="1"/>

</xml_diff>

<commit_message>
Finished mystery photo and rubric practice challenge
</commit_message>
<xml_diff>
--- a/AsfG_Portfolio_2505087.docx
+++ b/AsfG_Portfolio_2505087.docx
@@ -1614,10 +1614,12 @@
         <w:t xml:space="preserve"> Look after </w:t>
       </w:r>
       <w:bookmarkStart w:id="8" w:name="_Int_VptHzPn5"/>
+      <w:proofErr w:type="gramStart"/>
       <w:r>
         <w:t>myself</w:t>
       </w:r>
       <w:bookmarkEnd w:id="8"/>
+      <w:proofErr w:type="gramEnd"/>
       <w:r>
         <w:t>; eat, drink responsibly; keep a good work/life balance</w:t>
       </w:r>
@@ -2276,8 +2278,15 @@
       <w:r>
         <w:t xml:space="preserve">t in </w:t>
       </w:r>
-      <w:r>
-        <w:t xml:space="preserve">it’s </w:t>
+      <w:proofErr w:type="spellStart"/>
+      <w:proofErr w:type="gramStart"/>
+      <w:r>
+        <w:t>it’s</w:t>
+      </w:r>
+      <w:proofErr w:type="spellEnd"/>
+      <w:proofErr w:type="gramEnd"/>
+      <w:r>
+        <w:t xml:space="preserve"> </w:t>
       </w:r>
       <w:r>
         <w:t>creat</w:t>
@@ -2487,8 +2496,13 @@
       <w:r>
         <w:t xml:space="preserve">goes </w:t>
       </w:r>
-      <w:r>
-        <w:t xml:space="preserve">on I </w:t>
+      <w:proofErr w:type="gramStart"/>
+      <w:r>
+        <w:t>on</w:t>
+      </w:r>
+      <w:proofErr w:type="gramEnd"/>
+      <w:r>
+        <w:t xml:space="preserve"> I </w:t>
       </w:r>
       <w:r>
         <w:t xml:space="preserve">can </w:t>
@@ -2824,7 +2838,15 @@
     </w:p>
     <w:p>
       <w:r>
-        <w:t>To excel in this role, an artist must have an extensive understanding of human anatomy, a strong foundation in artistic principles, including form, structure, colour theory and lighting; and the ability to adeptly use industry-standard software tools for character creation including ZBrush, Maya and the Substance Suite.</w:t>
+        <w:t xml:space="preserve">To excel in this role, an artist must have an extensive understanding of human anatomy, a strong foundation in artistic principles, including form, structure, colour theory and lighting; and the ability to adeptly use industry-standard software tools for character creation including </w:t>
+      </w:r>
+      <w:proofErr w:type="spellStart"/>
+      <w:r>
+        <w:t>ZBrush</w:t>
+      </w:r>
+      <w:proofErr w:type="spellEnd"/>
+      <w:r>
+        <w:t>, Maya and the Substance Suite.</w:t>
       </w:r>
     </w:p>
     <w:p>
@@ -2922,7 +2944,15 @@
         </w:numPr>
       </w:pPr>
       <w:r>
-        <w:t>Continuously improve artistic skills and stay up-to-date with the latest industry trends and techniques.</w:t>
+        <w:t xml:space="preserve">Continuously improve artistic skills and stay </w:t>
+      </w:r>
+      <w:proofErr w:type="gramStart"/>
+      <w:r>
+        <w:t>up-to-date</w:t>
+      </w:r>
+      <w:proofErr w:type="gramEnd"/>
+      <w:r>
+        <w:t xml:space="preserve"> with the latest industry trends and techniques.</w:t>
       </w:r>
     </w:p>
     <w:p>
@@ -2953,7 +2983,15 @@
         </w:numPr>
       </w:pPr>
       <w:r>
-        <w:t>Strong skills in 3D modelling, sculpting, and texturing using industry-standard software, such as ZBrush, Maya, and Substance Painter.</w:t>
+        <w:t xml:space="preserve">Strong skills in 3D modelling, sculpting, and texturing using industry-standard software, such as </w:t>
+      </w:r>
+      <w:proofErr w:type="spellStart"/>
+      <w:r>
+        <w:t>ZBrush</w:t>
+      </w:r>
+      <w:proofErr w:type="spellEnd"/>
+      <w:r>
+        <w:t>, Maya, and Substance Painter.</w:t>
       </w:r>
     </w:p>
     <w:p>
@@ -3107,7 +3145,15 @@
         </w:numPr>
       </w:pPr>
       <w:r>
-        <w:t>Effectively use and adapt Megascans and other photogrammetry assets and textures</w:t>
+        <w:t xml:space="preserve">Effectively use and adapt </w:t>
+      </w:r>
+      <w:proofErr w:type="spellStart"/>
+      <w:r>
+        <w:t>Megascans</w:t>
+      </w:r>
+      <w:proofErr w:type="spellEnd"/>
+      <w:r>
+        <w:t xml:space="preserve"> and other photogrammetry assets and textures</w:t>
       </w:r>
     </w:p>
     <w:p>
@@ -3129,7 +3175,15 @@
         </w:numPr>
       </w:pPr>
       <w:r>
-        <w:t>Stay up-to-date on industry trends, tools, and best practices to continually improve the quality and efficiency of your work</w:t>
+        <w:t xml:space="preserve">Stay </w:t>
+      </w:r>
+      <w:proofErr w:type="gramStart"/>
+      <w:r>
+        <w:t>up-to-date</w:t>
+      </w:r>
+      <w:proofErr w:type="gramEnd"/>
+      <w:r>
+        <w:t xml:space="preserve"> on industry trends, tools, and best practices to continually improve the quality and efficiency of your work</w:t>
       </w:r>
     </w:p>
     <w:p>
@@ -3171,7 +3225,15 @@
         </w:numPr>
       </w:pPr>
       <w:r>
-        <w:t>Skilled in creating PBR materials using Substance Painter, Substance Designer or Quixel Mixer</w:t>
+        <w:t xml:space="preserve">Skilled in creating PBR materials using Substance Painter, Substance Designer or </w:t>
+      </w:r>
+      <w:proofErr w:type="spellStart"/>
+      <w:r>
+        <w:t>Quixel</w:t>
+      </w:r>
+      <w:proofErr w:type="spellEnd"/>
+      <w:r>
+        <w:t xml:space="preserve"> Mixer</w:t>
       </w:r>
     </w:p>
     <w:p>
@@ -3225,8 +3287,13 @@
       </w:pPr>
       <w:r>
         <w:lastRenderedPageBreak/>
-        <w:t>Experience with world-building tools such as World Machine, Houdini, or SpeedTree</w:t>
-      </w:r>
+        <w:t xml:space="preserve">Experience with world-building tools such as World Machine, Houdini, or </w:t>
+      </w:r>
+      <w:proofErr w:type="spellStart"/>
+      <w:r>
+        <w:t>SpeedTree</w:t>
+      </w:r>
+      <w:proofErr w:type="spellEnd"/>
     </w:p>
     <w:p>
       <w:pPr>
@@ -3247,7 +3314,15 @@
         </w:numPr>
       </w:pPr>
       <w:r>
-        <w:t>Experience with ZBrush or other sculpting tools</w:t>
+        <w:t xml:space="preserve">Experience with </w:t>
+      </w:r>
+      <w:proofErr w:type="spellStart"/>
+      <w:r>
+        <w:t>ZBrush</w:t>
+      </w:r>
+      <w:proofErr w:type="spellEnd"/>
+      <w:r>
+        <w:t xml:space="preserve"> or other sculpting tools</w:t>
       </w:r>
     </w:p>
     <w:p>
@@ -3329,7 +3404,15 @@
     </w:p>
     <w:p>
       <w:r>
-        <w:t>Visual storytelling is the key task of the Concept Artist, they imagine characters and worlds from off the page and bring the story to life. If you have a talent for visualizing abstract ideas a career as a Concept Artist could be for you! </w:t>
+        <w:t xml:space="preserve">Visual storytelling is the key task of the Concept </w:t>
+      </w:r>
+      <w:proofErr w:type="gramStart"/>
+      <w:r>
+        <w:t>Artist,</w:t>
+      </w:r>
+      <w:proofErr w:type="gramEnd"/>
+      <w:r>
+        <w:t xml:space="preserve"> they imagine characters and worlds from off the page and bring the story to life. If you have a talent for visualizing abstract ideas a career as a Concept Artist could be for you! </w:t>
       </w:r>
     </w:p>
     <w:p>
@@ -3562,7 +3645,15 @@
         <w:t xml:space="preserve"> when I finish the course is Junior Character Artist, the listing I found </w:t>
       </w:r>
       <w:r>
-        <w:t xml:space="preserve">on StudySmarter </w:t>
+        <w:t xml:space="preserve">on </w:t>
+      </w:r>
+      <w:proofErr w:type="spellStart"/>
+      <w:r>
+        <w:t>StudySmarter</w:t>
+      </w:r>
+      <w:proofErr w:type="spellEnd"/>
+      <w:r>
+        <w:t xml:space="preserve"> </w:t>
       </w:r>
       <w:r>
         <w:t>was for a studio in Portsmouth called Climax Studios</w:t>
@@ -3640,10 +3731,26 @@
         <w:t>preexisting knowledge</w:t>
       </w:r>
       <w:r>
-        <w:t xml:space="preserve"> of highpoly sculpting </w:t>
-      </w:r>
-      <w:r>
-        <w:t xml:space="preserve">and some lowpoly sculpting </w:t>
+        <w:t xml:space="preserve"> of </w:t>
+      </w:r>
+      <w:proofErr w:type="spellStart"/>
+      <w:r>
+        <w:t>highpoly</w:t>
+      </w:r>
+      <w:proofErr w:type="spellEnd"/>
+      <w:r>
+        <w:t xml:space="preserve"> sculpting </w:t>
+      </w:r>
+      <w:r>
+        <w:t xml:space="preserve">and some </w:t>
+      </w:r>
+      <w:proofErr w:type="spellStart"/>
+      <w:r>
+        <w:t>lowpoly</w:t>
+      </w:r>
+      <w:proofErr w:type="spellEnd"/>
+      <w:r>
+        <w:t xml:space="preserve"> sculpting </w:t>
       </w:r>
       <w:r>
         <w:t xml:space="preserve">that I learned </w:t>
@@ -3670,10 +3777,12 @@
         <w:t xml:space="preserve">Climax studios itself </w:t>
       </w:r>
       <w:bookmarkStart w:id="9" w:name="_Int_O8UgZ3AS"/>
+      <w:proofErr w:type="gramStart"/>
       <w:r>
         <w:t>appeals</w:t>
       </w:r>
       <w:bookmarkEnd w:id="9"/>
+      <w:proofErr w:type="gramEnd"/>
       <w:r>
         <w:t xml:space="preserve"> to me </w:t>
       </w:r>
@@ -3699,7 +3808,15 @@
         <w:t>, both in my art-related skills and my professional and career development ones</w:t>
       </w:r>
       <w:r>
-        <w:t xml:space="preserve">. This role fits into my future plans as the previously mentioned dynamics </w:t>
+        <w:t xml:space="preserve">. This role fits into my </w:t>
+      </w:r>
+      <w:proofErr w:type="gramStart"/>
+      <w:r>
+        <w:t>future plans</w:t>
+      </w:r>
+      <w:proofErr w:type="gramEnd"/>
+      <w:r>
+        <w:t xml:space="preserve"> as the previously mentioned dynamics </w:t>
       </w:r>
       <w:r>
         <w:t>in the studio makes it easy to gain experience and potentially climb the ladder</w:t>
@@ -3829,10 +3946,26 @@
         <w:t>)</w:t>
       </w:r>
       <w:r>
-        <w:t xml:space="preserve"> is a metroidvania </w:t>
-      </w:r>
-      <w:r>
-        <w:t>platformer game that takes place in the abandoned kingdom of Hallownest that has been taken over by a mysterious infecti</w:t>
+        <w:t xml:space="preserve"> is a </w:t>
+      </w:r>
+      <w:proofErr w:type="spellStart"/>
+      <w:r>
+        <w:t>metroidvania</w:t>
+      </w:r>
+      <w:proofErr w:type="spellEnd"/>
+      <w:r>
+        <w:t xml:space="preserve"> </w:t>
+      </w:r>
+      <w:r>
+        <w:t xml:space="preserve">platformer game that takes place in the abandoned kingdom of </w:t>
+      </w:r>
+      <w:proofErr w:type="spellStart"/>
+      <w:r>
+        <w:t>Hallownest</w:t>
+      </w:r>
+      <w:proofErr w:type="spellEnd"/>
+      <w:r>
+        <w:t xml:space="preserve"> that has been taken over by a mysterious infecti</w:t>
       </w:r>
       <w:r>
         <w:t>on</w:t>
@@ -4391,7 +4524,15 @@
               <w:t xml:space="preserve"> representing </w:t>
             </w:r>
             <w:r>
-              <w:t xml:space="preserve">the environment in an easy to understand way so that the player </w:t>
+              <w:t xml:space="preserve">the environment in an </w:t>
+            </w:r>
+            <w:proofErr w:type="gramStart"/>
+            <w:r>
+              <w:t>easy to understand</w:t>
+            </w:r>
+            <w:proofErr w:type="gramEnd"/>
+            <w:r>
+              <w:t xml:space="preserve"> way so that the player </w:t>
             </w:r>
             <w:r>
               <w:t xml:space="preserve">always </w:t>
@@ -4539,7 +4680,58 @@
     </w:p>
     <w:p>
       <w:r>
-        <w:t>[Insert the deliverable for this challenge here.]</w:t>
+        <w:t>Looking at the rubric for the first progress check, I believe that I scored somewhere around 13. The rubric says that to have scored in this range that against the MoSCoW that “achieves a variety of Should objectives and often some Could and Would/Wish</w:t>
+      </w:r>
+      <w:r>
+        <w:t>.” I have tried my best so far to fulfil as far down the MoSCoW list as I can for each challenge, which I think gives me enough reason to put myself in the top of this band</w:t>
+      </w:r>
+      <w:r>
+        <w:t>. I don’t think I put quite enough effort towards would or wish objectives to place myself</w:t>
+      </w:r>
+      <w:r>
+        <w:t xml:space="preserve"> in the higher band. </w:t>
+      </w:r>
+      <w:r>
+        <w:t xml:space="preserve">However, </w:t>
+      </w:r>
+      <w:proofErr w:type="gramStart"/>
+      <w:r>
+        <w:t>all of</w:t>
+      </w:r>
+      <w:proofErr w:type="gramEnd"/>
+      <w:r>
+        <w:t xml:space="preserve"> the challenges that were available at the time, I had at least attempted to some degree, which does line up with the higher end of the rubric</w:t>
+      </w:r>
+      <w:r>
+        <w:t xml:space="preserve"> which </w:t>
+      </w:r>
+      <w:proofErr w:type="gramStart"/>
+      <w:r>
+        <w:t>says</w:t>
+      </w:r>
+      <w:proofErr w:type="gramEnd"/>
+      <w:r>
+        <w:t xml:space="preserve"> “All challenges so far as represented”.</w:t>
+      </w:r>
+      <w:r>
+        <w:t xml:space="preserve"> To improve upon my scores</w:t>
+      </w:r>
+      <w:r>
+        <w:t xml:space="preserve"> in future progress checks, I think I should try to make more effort into the Could and Would/Wish tasks of the MoSCoW</w:t>
+      </w:r>
+      <w:r>
+        <w:t xml:space="preserve"> and look at the learning objectives more closely to improve the quality of my </w:t>
+      </w:r>
+      <w:r>
+        <w:t xml:space="preserve">work. As well as this I will continue staying on top of </w:t>
+      </w:r>
+      <w:proofErr w:type="gramStart"/>
+      <w:r>
+        <w:t>all of</w:t>
+      </w:r>
+      <w:proofErr w:type="gramEnd"/>
+      <w:r>
+        <w:t xml:space="preserve"> the challenges each week to improve the outcomes and allow me to do this effectively and gain the best chance of moving into the top mark band. </w:t>
       </w:r>
     </w:p>
     <w:p>
@@ -4565,6 +4757,7 @@
           <w:bCs w:val="0"/>
           <w:i/>
           <w:iCs/>
+          <w:noProof/>
           <w:color w:val="5F497A"/>
           <w:sz w:val="24"/>
           <w:szCs w:val="24"/>
@@ -4626,6 +4819,9 @@
     </w:p>
     <w:p>
       <w:r>
+        <w:rPr>
+          <w:noProof/>
+        </w:rPr>
         <w:drawing>
           <wp:inline distT="0" distB="0" distL="0" distR="0" wp14:anchorId="1D4486CF" wp14:editId="298B6BF0">
             <wp:extent cx="5731510" cy="4197985"/>
@@ -4675,40 +4871,143 @@
       </w:r>
     </w:p>
     <w:p>
-      <w:pPr>
-        <w:pStyle w:val="Quote"/>
-      </w:pPr>
-      <w:r>
-        <w:t>Update the heading and insert the deliverable for this challenge. If you need subsections you can use Heading 2 or 3; don’t use Heading 1 again until the next challenge.</w:t>
-      </w:r>
-    </w:p>
-    <w:p>
-      <w:pPr>
-        <w:pStyle w:val="Quote"/>
-      </w:pPr>
-      <w:r>
-        <w:t>Remember the other guidance in the assignment page about formatting, inserting images, and other things.</w:t>
-      </w:r>
-    </w:p>
-    <w:p>
-      <w:pPr>
-        <w:pStyle w:val="Quote"/>
-      </w:pPr>
-      <w:r>
-        <w:t>Scope &amp; word count limit (or equivalent): Varies by challenge: see the challenge page.</w:t>
-      </w:r>
-    </w:p>
-    <w:p>
-      <w:pPr>
-        <w:pStyle w:val="Quote"/>
-      </w:pPr>
-      <w:r>
-        <w:t>Get ready for the next challenge by taking a copy of the heading from here (and optionally the purple text, but remember to remove it before submission).</w:t>
-      </w:r>
-    </w:p>
-    <w:p>
-      <w:r>
-        <w:t>[Insert the deliverable for this challenge here.]</w:t>
+      <w:r>
+        <w:rPr>
+          <w:noProof/>
+        </w:rPr>
+        <w:drawing>
+          <wp:inline distT="0" distB="0" distL="0" distR="0" wp14:anchorId="71CB5A5E" wp14:editId="3D1251B3">
+            <wp:extent cx="1893042" cy="2524125"/>
+            <wp:effectExtent l="0" t="0" r="0" b="0"/>
+            <wp:docPr id="1208359219" name="Picture 4"/>
+            <wp:cNvGraphicFramePr>
+              <a:graphicFrameLocks xmlns:a="http://schemas.openxmlformats.org/drawingml/2006/main" noChangeAspect="1"/>
+            </wp:cNvGraphicFramePr>
+            <a:graphic xmlns:a="http://schemas.openxmlformats.org/drawingml/2006/main">
+              <a:graphicData uri="http://schemas.openxmlformats.org/drawingml/2006/picture">
+                <pic:pic xmlns:pic="http://schemas.openxmlformats.org/drawingml/2006/picture">
+                  <pic:nvPicPr>
+                    <pic:cNvPr id="1208359219" name="Picture 1208359219"/>
+                    <pic:cNvPicPr/>
+                  </pic:nvPicPr>
+                  <pic:blipFill>
+                    <a:blip r:embed="rId27" cstate="print">
+                      <a:extLst>
+                        <a:ext uri="{28A0092B-C50C-407E-A947-70E740481C1C}">
+                          <a14:useLocalDpi xmlns:a14="http://schemas.microsoft.com/office/drawing/2010/main" val="0"/>
+                        </a:ext>
+                      </a:extLst>
+                    </a:blip>
+                    <a:stretch>
+                      <a:fillRect/>
+                    </a:stretch>
+                  </pic:blipFill>
+                  <pic:spPr>
+                    <a:xfrm>
+                      <a:off x="0" y="0"/>
+                      <a:ext cx="1910404" cy="2547275"/>
+                    </a:xfrm>
+                    <a:prstGeom prst="rect">
+                      <a:avLst/>
+                    </a:prstGeom>
+                  </pic:spPr>
+                </pic:pic>
+              </a:graphicData>
+            </a:graphic>
+          </wp:inline>
+        </w:drawing>
+      </w:r>
+      <w:r>
+        <w:rPr>
+          <w:noProof/>
+        </w:rPr>
+        <w:drawing>
+          <wp:inline distT="0" distB="0" distL="0" distR="0" wp14:anchorId="28A51AC9" wp14:editId="22414575">
+            <wp:extent cx="1895475" cy="2527370"/>
+            <wp:effectExtent l="0" t="0" r="0" b="6350"/>
+            <wp:docPr id="1937800752" name="Picture 5"/>
+            <wp:cNvGraphicFramePr>
+              <a:graphicFrameLocks xmlns:a="http://schemas.openxmlformats.org/drawingml/2006/main" noChangeAspect="1"/>
+            </wp:cNvGraphicFramePr>
+            <a:graphic xmlns:a="http://schemas.openxmlformats.org/drawingml/2006/main">
+              <a:graphicData uri="http://schemas.openxmlformats.org/drawingml/2006/picture">
+                <pic:pic xmlns:pic="http://schemas.openxmlformats.org/drawingml/2006/picture">
+                  <pic:nvPicPr>
+                    <pic:cNvPr id="1937800752" name="Picture 1937800752"/>
+                    <pic:cNvPicPr/>
+                  </pic:nvPicPr>
+                  <pic:blipFill>
+                    <a:blip r:embed="rId28" cstate="print">
+                      <a:extLst>
+                        <a:ext uri="{28A0092B-C50C-407E-A947-70E740481C1C}">
+                          <a14:useLocalDpi xmlns:a14="http://schemas.microsoft.com/office/drawing/2010/main" val="0"/>
+                        </a:ext>
+                      </a:extLst>
+                    </a:blip>
+                    <a:stretch>
+                      <a:fillRect/>
+                    </a:stretch>
+                  </pic:blipFill>
+                  <pic:spPr>
+                    <a:xfrm>
+                      <a:off x="0" y="0"/>
+                      <a:ext cx="1911044" cy="2548129"/>
+                    </a:xfrm>
+                    <a:prstGeom prst="rect">
+                      <a:avLst/>
+                    </a:prstGeom>
+                  </pic:spPr>
+                </pic:pic>
+              </a:graphicData>
+            </a:graphic>
+          </wp:inline>
+        </w:drawing>
+      </w:r>
+      <w:r>
+        <w:rPr>
+          <w:noProof/>
+        </w:rPr>
+        <w:drawing>
+          <wp:inline distT="0" distB="0" distL="0" distR="0" wp14:anchorId="4D38A573" wp14:editId="423C66D1">
+            <wp:extent cx="1885950" cy="2514669"/>
+            <wp:effectExtent l="0" t="0" r="0" b="0"/>
+            <wp:docPr id="1916293331" name="Picture 6"/>
+            <wp:cNvGraphicFramePr>
+              <a:graphicFrameLocks xmlns:a="http://schemas.openxmlformats.org/drawingml/2006/main" noChangeAspect="1"/>
+            </wp:cNvGraphicFramePr>
+            <a:graphic xmlns:a="http://schemas.openxmlformats.org/drawingml/2006/main">
+              <a:graphicData uri="http://schemas.openxmlformats.org/drawingml/2006/picture">
+                <pic:pic xmlns:pic="http://schemas.openxmlformats.org/drawingml/2006/picture">
+                  <pic:nvPicPr>
+                    <pic:cNvPr id="1916293331" name="Picture 1916293331"/>
+                    <pic:cNvPicPr/>
+                  </pic:nvPicPr>
+                  <pic:blipFill>
+                    <a:blip r:embed="rId29" cstate="print">
+                      <a:extLst>
+                        <a:ext uri="{28A0092B-C50C-407E-A947-70E740481C1C}">
+                          <a14:useLocalDpi xmlns:a14="http://schemas.microsoft.com/office/drawing/2010/main" val="0"/>
+                        </a:ext>
+                      </a:extLst>
+                    </a:blip>
+                    <a:stretch>
+                      <a:fillRect/>
+                    </a:stretch>
+                  </pic:blipFill>
+                  <pic:spPr>
+                    <a:xfrm>
+                      <a:off x="0" y="0"/>
+                      <a:ext cx="1891844" cy="2522527"/>
+                    </a:xfrm>
+                    <a:prstGeom prst="rect">
+                      <a:avLst/>
+                    </a:prstGeom>
+                  </pic:spPr>
+                </pic:pic>
+              </a:graphicData>
+            </a:graphic>
+          </wp:inline>
+        </w:drawing>
       </w:r>
     </w:p>
     <w:p>
@@ -4749,7 +5048,7 @@
                     </pic:cNvPicPr>
                   </pic:nvPicPr>
                   <pic:blipFill>
-                    <a:blip r:embed="rId27">
+                    <a:blip r:embed="rId30">
                       <a:extLst>
                         <a:ext uri="{28A0092B-C50C-407E-A947-70E740481C1C}">
                           <a14:useLocalDpi xmlns:a14="http://schemas.microsoft.com/office/drawing/2010/main" val="0"/>
@@ -4806,7 +5105,7 @@
                     </pic:cNvPicPr>
                   </pic:nvPicPr>
                   <pic:blipFill>
-                    <a:blip r:embed="rId28">
+                    <a:blip r:embed="rId31">
                       <a:extLst>
                         <a:ext uri="{28A0092B-C50C-407E-A947-70E740481C1C}">
                           <a14:useLocalDpi xmlns:a14="http://schemas.microsoft.com/office/drawing/2010/main" val="0"/>
@@ -4860,7 +5159,7 @@
                     <pic:cNvPicPr/>
                   </pic:nvPicPr>
                   <pic:blipFill>
-                    <a:blip r:embed="rId29"/>
+                    <a:blip r:embed="rId32"/>
                     <a:stretch>
                       <a:fillRect/>
                     </a:stretch>
@@ -4887,7 +5186,15 @@
       </w:pPr>
       <w:r>
         <w:lastRenderedPageBreak/>
-        <w:t xml:space="preserve"> [WkX, XX] Challenge name here</w:t>
+        <w:t xml:space="preserve"> [</w:t>
+      </w:r>
+      <w:proofErr w:type="spellStart"/>
+      <w:r>
+        <w:t>WkX</w:t>
+      </w:r>
+      <w:proofErr w:type="spellEnd"/>
+      <w:r>
+        <w:t>, XX] Challenge name here</w:t>
       </w:r>
     </w:p>
     <w:p>
@@ -4895,7 +5202,15 @@
         <w:pStyle w:val="Quote"/>
       </w:pPr>
       <w:r>
-        <w:t>Update the heading and insert the deliverable for this challenge. If you need subsections you can use Heading 2 or 3; don’t use Heading 1 again until the next challenge.</w:t>
+        <w:t xml:space="preserve">Update the heading and insert the deliverable for this challenge. If you need </w:t>
+      </w:r>
+      <w:proofErr w:type="gramStart"/>
+      <w:r>
+        <w:t>subsections</w:t>
+      </w:r>
+      <w:proofErr w:type="gramEnd"/>
+      <w:r>
+        <w:t xml:space="preserve"> you can use Heading 2 or 3; don’t use Heading 1 again until the next challenge.</w:t>
       </w:r>
     </w:p>
     <w:p>
@@ -4919,7 +5234,15 @@
         <w:pStyle w:val="Quote"/>
       </w:pPr>
       <w:r>
-        <w:t>Get ready for the next challenge by taking a copy of the heading from here (and optionally the purple text, but remember to remove it before submission).</w:t>
+        <w:t xml:space="preserve">Get ready for the next challenge by taking a copy of the heading from here (and optionally the purple </w:t>
+      </w:r>
+      <w:proofErr w:type="gramStart"/>
+      <w:r>
+        <w:t>text, but</w:t>
+      </w:r>
+      <w:proofErr w:type="gramEnd"/>
+      <w:r>
+        <w:t xml:space="preserve"> remember to remove it before submission).</w:t>
       </w:r>
     </w:p>
     <w:p>
@@ -5023,7 +5346,7 @@
         </w:rPr>
         <w:t xml:space="preserve">Hollow Knight Wiki (2026) Available at: </w:t>
       </w:r>
-      <w:hyperlink r:id="rId30">
+      <w:hyperlink r:id="rId33">
         <w:r>
           <w:rPr>
             <w:rStyle w:val="Hyperlink"/>
@@ -5089,7 +5412,7 @@
         </w:rPr>
         <w:t xml:space="preserve"> September. Available at: </w:t>
       </w:r>
-      <w:hyperlink r:id="rId31">
+      <w:hyperlink r:id="rId34">
         <w:r>
           <w:rPr>
             <w:rStyle w:val="Hyperlink"/>
@@ -5125,8 +5448,8 @@
     <w:p/>
     <w:p/>
     <w:sectPr>
-      <w:headerReference w:type="default" r:id="rId32"/>
-      <w:footerReference w:type="default" r:id="rId33"/>
+      <w:headerReference w:type="default" r:id="rId35"/>
+      <w:footerReference w:type="default" r:id="rId36"/>
       <w:pgSz w:w="11906" w:h="16838"/>
       <w:pgMar w:top="1440" w:right="1440" w:bottom="1440" w:left="1440" w:header="708" w:footer="708" w:gutter="0"/>
       <w:pgNumType w:start="1"/>
@@ -8250,6 +8573,15 @@
 </file>
 
 <file path=customXml/item1.xml><?xml version="1.0" encoding="utf-8"?>
+<?mso-contentType ?>
+<FormTemplates xmlns="http://schemas.microsoft.com/sharepoint/v3/contenttype/forms">
+  <Display>DocumentLibraryForm</Display>
+  <Edit>DocumentLibraryForm</Edit>
+  <New>DocumentLibraryForm</New>
+</FormTemplates>
+</file>
+
+<file path=customXml/item2.xml><?xml version="1.0" encoding="utf-8"?>
 <ct:contentTypeSchema xmlns:ct="http://schemas.microsoft.com/office/2006/metadata/contentType" xmlns:ma="http://schemas.microsoft.com/office/2006/metadata/properties/metaAttributes" ct:_="" ma:_="" ma:contentTypeName="Document" ma:contentTypeID="0x010100D9F37D7A4EDC1040A880A2099F6664D1" ma:contentTypeVersion="17" ma:contentTypeDescription="Create a new document." ma:contentTypeScope="" ma:versionID="08efb0d5db8d1d6db33b2f38db1086d5">
   <xsd:schema xmlns:xsd="http://www.w3.org/2001/XMLSchema" xmlns:xs="http://www.w3.org/2001/XMLSchema" xmlns:p="http://schemas.microsoft.com/office/2006/metadata/properties" xmlns:ns2="8d4a1fdf-0f94-4e24-9675-6342052676c2" xmlns:ns3="e2a5ad16-c4e7-4aee-be6c-2d964216012c" xmlns:ns4="efc3e123-a60a-4a17-aaf1-487e28d9a3b3" targetNamespace="http://schemas.microsoft.com/office/2006/metadata/properties" ma:root="true" ma:fieldsID="8080e491b76ba13211cd04da0d5e9449" ns2:_="" ns3:_="" ns4:_="">
     <xsd:import namespace="8d4a1fdf-0f94-4e24-9675-6342052676c2"/>
@@ -8510,15 +8842,6 @@
 </ct:contentTypeSchema>
 </file>
 
-<file path=customXml/item2.xml><?xml version="1.0" encoding="utf-8"?>
-<?mso-contentType ?>
-<FormTemplates xmlns="http://schemas.microsoft.com/sharepoint/v3/contenttype/forms">
-  <Display>DocumentLibraryForm</Display>
-  <Edit>DocumentLibraryForm</Edit>
-  <New>DocumentLibraryForm</New>
-</FormTemplates>
-</file>
-
 <file path=customXml/item3.xml><?xml version="1.0" encoding="utf-8"?>
 <p:properties xmlns:p="http://schemas.microsoft.com/office/2006/metadata/properties" xmlns:xsi="http://www.w3.org/2001/XMLSchema-instance" xmlns:pc="http://schemas.microsoft.com/office/infopath/2007/PartnerControls">
   <documentManagement>
@@ -8535,6 +8858,14 @@
 </file>
 
 <file path=customXml/itemProps1.xml><?xml version="1.0" encoding="utf-8"?>
+<ds:datastoreItem xmlns:ds="http://schemas.openxmlformats.org/officeDocument/2006/customXml" ds:itemID="{0C9F64BE-1583-4619-A2B5-DACC1568FF50}">
+  <ds:schemaRefs>
+    <ds:schemaRef ds:uri="http://schemas.microsoft.com/sharepoint/v3/contenttype/forms"/>
+  </ds:schemaRefs>
+</ds:datastoreItem>
+</file>
+
+<file path=customXml/itemProps2.xml><?xml version="1.0" encoding="utf-8"?>
 <ds:datastoreItem xmlns:ds="http://schemas.openxmlformats.org/officeDocument/2006/customXml" ds:itemID="{277562E8-9AEC-4BC0-8DEC-73418E65CD9A}">
   <ds:schemaRefs>
     <ds:schemaRef ds:uri="http://schemas.microsoft.com/office/2006/metadata/contentType"/>
@@ -8550,14 +8881,6 @@
     <ds:schemaRef ds:uri="http://purl.org/dc/elements/1.1/"/>
     <ds:schemaRef ds:uri="http://purl.org/dc/terms/"/>
     <ds:schemaRef ds:uri="http://schemas.microsoft.com/internal/obd"/>
-  </ds:schemaRefs>
-</ds:datastoreItem>
-</file>
-
-<file path=customXml/itemProps2.xml><?xml version="1.0" encoding="utf-8"?>
-<ds:datastoreItem xmlns:ds="http://schemas.openxmlformats.org/officeDocument/2006/customXml" ds:itemID="{0C9F64BE-1583-4619-A2B5-DACC1568FF50}">
-  <ds:schemaRefs>
-    <ds:schemaRef ds:uri="http://schemas.microsoft.com/sharepoint/v3/contenttype/forms"/>
   </ds:schemaRefs>
 </ds:datastoreItem>
 </file>

</xml_diff>